<commit_message>
Atualiza autoria para Dr. Gabriel Fortes (UFAL)
Trocas em 3 arquivos do handoff:
- handoff/07_nota_tecnica_contrafactuais.md: 'Autor: Dr. Gabriel
  Fortes (UFAL)' no cabeçalho + email no rodapé. Docx regerado.
- handoff/04_governanca_dado.md: citação ABNT com FORTES, Gabriel
  como autor; equipe responsável com email gabriel.macedo@nees.ufal.br
- handoff/README.md: contato com autor + email; outros papéis ficam
  'a preencher' conforme integração do time

NEES/UFAL continua como afiliação institucional do projeto, mas a
autoria do material curatorial fica explícita.
</commit_message>
<xml_diff>
--- a/handoff/07_nota_tecnica_contrafactuais.docx
+++ b/handoff/07_nota_tecnica_contrafactuais.docx
@@ -27,10 +27,10 @@
         <w:rPr>
           <w:b/>
         </w:rPr>
-        <w:t>Autores:</w:t>
-      </w:r>
-      <w:r>
-        <w:t xml:space="preserve"> Time NEES/UFAL · Observatório de Equidade Educacional </w:t>
+        <w:t>Autor:</w:t>
+      </w:r>
+      <w:r>
+        <w:t xml:space="preserve"> Dr. Gabriel Fortes (Universidade Federal de Alagoas) · Observatório de Equidade Educacional </w:t>
       </w:r>
       <w:r>
         <w:rPr>
@@ -3830,7 +3830,7 @@
         <w:rPr>
           <w:i/>
         </w:rPr>
-        <w:t>Documento aberto a comentários. Sugestões e correções vão via Pull Request no GitHub ou email para a equipe NEES/UFAL.</w:t>
+        <w:t>Documento aberto a comentários. Sugestões e correções vão via Pull Request no GitHub ou email para o autor (gabriel.macedo@nees.ufal.br).</w:t>
       </w:r>
     </w:p>
     <w:sectPr>

</xml_diff>